<commit_message>
Refactors workspace setup scripts and updates project documentation
Enhances the development environment setup by introducing flexible Composer scripts for configuring SQLite and MySQL databases automatically. Refactors the underlying setup PHP script to handle environment variable injection and migration execution based on command-line arguments. Additionally, updates the README to reflect the new setup process, current technology stack, and academic information, while bumping the version of the Vision and Scope document.
</commit_message>
<xml_diff>
--- a/docs/Documento de Especificación de Requisitos de Software.docx
+++ b/docs/Documento de Especificación de Requisitos de Software.docx
@@ -16604,10 +16604,10 @@
           <w:szCs w:val="36"/>
         </w:rPr>
         <w:drawing>
-          <wp:inline distT="0" distB="0" distL="0" distR="0" wp14:anchorId="6F4D06B0" wp14:editId="75FC0243">
-            <wp:extent cx="6126480" cy="2301240"/>
-            <wp:effectExtent l="0" t="0" r="7620" b="3810"/>
-            <wp:docPr id="983806908" name="Imagen 1"/>
+          <wp:inline distT="0" distB="0" distL="0" distR="0" wp14:anchorId="16FCB260" wp14:editId="6B938FB7">
+            <wp:extent cx="6121400" cy="2616200"/>
+            <wp:effectExtent l="0" t="0" r="0" b="0"/>
+            <wp:docPr id="977671220" name="Imagen 1"/>
             <wp:cNvGraphicFramePr>
               <a:graphicFrameLocks xmlns:a="http://schemas.openxmlformats.org/drawingml/2006/main" noChangeAspect="1"/>
             </wp:cNvGraphicFramePr>
@@ -16636,7 +16636,7 @@
                   <pic:spPr bwMode="auto">
                     <a:xfrm>
                       <a:off x="0" y="0"/>
-                      <a:ext cx="6126480" cy="2301240"/>
+                      <a:ext cx="6121400" cy="2616200"/>
                     </a:xfrm>
                     <a:prstGeom prst="rect">
                       <a:avLst/>

</xml_diff>

<commit_message>
Update documentation assets and fix README grammar
- Corrects various Spanish spelling and grammatical errors in the project description to improve readability.
- Refreshes login screenshots for both light and dark modes and removes an obsolete domain model diagram.
</commit_message>
<xml_diff>
--- a/docs/Documento de Especificación de Requisitos de Software.docx
+++ b/docs/Documento de Especificación de Requisitos de Software.docx
@@ -16604,9 +16604,9 @@
           <w:szCs w:val="36"/>
         </w:rPr>
         <w:drawing>
-          <wp:inline distT="0" distB="0" distL="0" distR="0" wp14:anchorId="16FCB260" wp14:editId="6B938FB7">
-            <wp:extent cx="6121400" cy="2616200"/>
-            <wp:effectExtent l="0" t="0" r="0" b="0"/>
+          <wp:inline distT="0" distB="0" distL="0" distR="0" wp14:anchorId="16FCB260" wp14:editId="30354766">
+            <wp:extent cx="6121400" cy="2399531"/>
+            <wp:effectExtent l="0" t="0" r="0" b="1270"/>
             <wp:docPr id="977671220" name="Imagen 1"/>
             <wp:cNvGraphicFramePr>
               <a:graphicFrameLocks xmlns:a="http://schemas.openxmlformats.org/drawingml/2006/main" noChangeAspect="1"/>
@@ -16615,7 +16615,7 @@
               <a:graphicData uri="http://schemas.openxmlformats.org/drawingml/2006/picture">
                 <pic:pic xmlns:pic="http://schemas.openxmlformats.org/drawingml/2006/picture">
                   <pic:nvPicPr>
-                    <pic:cNvPr id="0" name="Picture 1"/>
+                    <pic:cNvPr id="977671220" name="Imagen 1"/>
                     <pic:cNvPicPr>
                       <a:picLocks noChangeAspect="1" noChangeArrowheads="1"/>
                     </pic:cNvPicPr>
@@ -16628,7 +16628,6 @@
                         </a:ext>
                       </a:extLst>
                     </a:blip>
-                    <a:srcRect/>
                     <a:stretch>
                       <a:fillRect/>
                     </a:stretch>
@@ -16636,7 +16635,7 @@
                   <pic:spPr bwMode="auto">
                     <a:xfrm>
                       <a:off x="0" y="0"/>
-                      <a:ext cx="6121400" cy="2616200"/>
+                      <a:ext cx="6121400" cy="2399531"/>
                     </a:xfrm>
                     <a:prstGeom prst="rect">
                       <a:avLst/>

</xml_diff>